<commit_message>
docs(TDG): documento final Markdown, anexos redaccion-activa y actualizaciones relacionadas
Incluye TDG_Escuela_Pass_Documento_Final.md, carpeta redaccion-activa, ajustes en docs técnicos y Word, eliminación de entidad pickup-authorization y otros cambios pendientes en el monorepo.

Co-authored-by: Cursor <cursoragent@cursor.com>
</commit_message>
<xml_diff>
--- a/01 - Escuela Pass/docs/tdg/word/TDG_Escuela_Pass_Documento_Principal.docx
+++ b/01 - Escuela Pass/docs/tdg/word/TDG_Escuela_Pass_Documento_Principal.docx
@@ -2884,6 +2884,51 @@
     <w:p>
       <w:r>
         <w:t xml:space="preserve">• Anexo 12. Nota de verificación documental.</w:t>
+      </w:r>
+    </w:p>
+    <w:p>
+      <w:r>
+        <w:br w:type="page"/>
+      </w:r>
+    </w:p>
+    <w:p>
+      <w:pPr>
+        <w:pStyle w:val="Heading1"/>
+      </w:pPr>
+      <w:r>
+        <w:t>Ampliación documental y criterios de extensión (48–50 hojas)</w:t>
+      </w:r>
+    </w:p>
+    <w:p>
+      <w:pPr>
+        <w:pStyle w:val="Heading3"/>
+      </w:pPr>
+      <w:r>
+        <w:t>Extensión obligatoria del documento principal: entre 48 y 50 hojas inclusives</w:t>
+      </w:r>
+    </w:p>
+    <w:p/>
+    <w:p>
+      <w:r>
+        <w:t>El TDG principal debe quedar en **48, 49 u 50 hojas** conforme a la definición de página del manual institucional (Times New Roman 12 pt, interlineado sencillo, márgenes 2,54 cm). No menos de 48 ni más de 50.</w:t>
+      </w:r>
+    </w:p>
+    <w:p/>
+    <w:p>
+      <w:r>
+        <w:t>Calibración en Microsoft Word: tras integrar el contenido, usar **Vista → Múltiples páginas** o el contador del pie con **Insertar → Número de página**; ajustar espacio entre párrafos de capítulos, tamaño de figuras grandes y mover tablas extensas a anexos hasta entrar en el rango. Si el cuerpo queda por debajo de 48, desarrollar conclusiones, marco referencial o resultados por objetivo específico citando evidencias del código. Si supera 50, trasladar detalle a anexos correspondientes (API, ER, pruebas, manuales).</w:t>
+      </w:r>
+    </w:p>
+    <w:p/>
+    <w:p>
+      <w:r>
+        <w:t>Órdenes del documento: respetar plantilla `TDG_Plantilla y Normas.docx` y manual de estilo PDF. El detalle exhaustivo de endpoints y tablas permanece en anexos; en el cuerpo del TDG se sintetizan decisiones y trazabilidad a módulos listados en el inventario automatizado.</w:t>
+      </w:r>
+    </w:p>
+    <w:p/>
+    <w:p>
+      <w:r>
+        <w:t>Síntesis técnica (actualizar redacción en capítulos de desarrollo): módulos clave — HealthModule, MailModule, AuthModule, AccessModule, CircuitModule, ClassAttendanceModule, ClassSessionsModule, NoticesModule, PaymentsModule, AttendanceModule, ActivitiesModule, AttentionNotesModule, AcademicPeriodsModule, ReportCardsModule, AcademicSchedulerModule, ReportsModule, SchoolModule, ExportsModule, DashboardModule, SchedulesModule, SchoolCalendarModule, SettingsModule, VehiclesModule, DocumentsModule, AuditModule, …. Total rutas HTTP inventariadas: 241. Total tablas entidad: 50.</w:t>
       </w:r>
     </w:p>
     <ns0:sectPr xmlns:ns0="http://schemas.openxmlformats.org/wordprocessingml/2006/main" xmlns:ns1="http://schemas.openxmlformats.org/officeDocument/2006/relationships">

</xml_diff>